<commit_message>
Update all 15 showcase samples with rich imagery, charts, and PowerPoint Morph transitions
</commit_message>
<xml_diff>
--- a/freelance/samples/docx/Business_Plan_Campus_Coffee_Cart.docx
+++ b/freelance/samples/docx/Business_Plan_Campus_Coffee_Cart.docx
@@ -4,113 +4,54 @@
   <w:body>
     <w:p>
       <w:pPr>
-        <w:spacing w:before="720" w:after="80"/>
+        <w:spacing w:before="2800"/>
         <w:jc w:val="center"/>
       </w:pPr>
       <w:r>
         <w:rPr>
           <w:rFonts w:ascii="Calibri" w:hAnsi="Calibri"/>
           <w:b/>
-          <w:color w:val="4A5568"/>
+          <w:color w:val="6B3A19"/>
+          <w:sz w:val="42"/>
+        </w:rPr>
+        <w:t>Commercial Feasibility &amp; Business Plan:</w:t>
+        <w:br/>
+        <w:t>The Campus Coffee Cart</w:t>
+        <w:br/>
+      </w:r>
+      <w:r>
+        <w:rPr>
+          <w:rFonts w:ascii="Calibri" w:hAnsi="Calibri"/>
+          <w:color w:val="646464"/>
           <w:sz w:val="24"/>
         </w:rPr>
-        <w:t>STI WEST NEGROS UNIVERSITY</w:t>
+        <w:t>Specialty On-the-Go Espresso, Cold Brews, and Artisanal Refreshments</w:t>
+        <w:br/>
+        <w:t>Tailored for STI West Negros University</w:t>
+        <w:br/>
+        <w:br/>
       </w:r>
     </w:p>
     <w:p>
       <w:pPr>
-        <w:spacing w:after="1440"/>
+        <w:spacing w:before="2400"/>
         <w:jc w:val="center"/>
       </w:pPr>
       <w:r>
         <w:rPr>
           <w:rFonts w:ascii="Calibri" w:hAnsi="Calibri"/>
-          <w:color w:val="718096"/>
-          <w:sz w:val="20"/>
+          <w:color w:val="464646"/>
+          <w:sz w:val="22"/>
         </w:rPr>
-        <w:t>College of Information and Communications Technology</w:t>
-      </w:r>
-    </w:p>
-    <w:p>
-      <w:pPr>
-        <w:spacing w:after="280"/>
-        <w:jc w:val="center"/>
-      </w:pPr>
-      <w:r>
-        <w:rPr>
-          <w:rFonts w:ascii="Calibri" w:hAnsi="Calibri"/>
-          <w:b/>
-          <w:color w:val="78350F"/>
-          <w:sz w:val="48"/>
-        </w:rPr>
-        <w:t>Business Plan: 'Brewed Horizon' Campus Coffee Cart</w:t>
-      </w:r>
-    </w:p>
-    <w:p>
-      <w:pPr>
-        <w:spacing w:after="320"/>
-        <w:jc w:val="center"/>
-      </w:pPr>
-      <w:r>
-        <w:rPr>
-          <w:color w:val="78350F"/>
-          <w:sz w:val="20"/>
-        </w:rPr>
-        <w:t>————————————————————————————</w:t>
-      </w:r>
-    </w:p>
-    <w:p>
-      <w:pPr>
-        <w:spacing w:after="2800"/>
-        <w:jc w:val="center"/>
-      </w:pPr>
-      <w:r>
-        <w:rPr>
-          <w:rFonts w:ascii="Calibri" w:hAnsi="Calibri"/>
-          <w:i/>
-          <w:color w:val="4A5568"/>
-          <w:sz w:val="26"/>
-        </w:rPr>
-        <w:t>A Feasibility Study and Strategic Commercial Model for STI West Negros University</w:t>
-      </w:r>
-    </w:p>
-    <w:p>
-      <w:pPr>
-        <w:spacing w:line="312" w:lineRule="auto" w:after="400"/>
-        <w:jc w:val="center"/>
-      </w:pPr>
-      <w:r>
-        <w:rPr>
-          <w:rFonts w:ascii="Calibri" w:hAnsi="Calibri"/>
-          <w:color w:val="718096"/>
-          <w:sz w:val="20"/>
-        </w:rPr>
-        <w:t>Comprehensive Business Plan</w:t>
+        <w:t>Prepared by: Jhon Paulo Gascon</w:t>
         <w:br/>
-        <w:t>Presented by:</w:t>
+        <w:t>BS Information Technology</w:t>
         <w:br/>
-      </w:r>
-      <w:r>
-        <w:rPr>
-          <w:rFonts w:ascii="Calibri" w:hAnsi="Calibri"/>
-          <w:b/>
-          <w:color w:val="78350F"/>
-          <w:sz w:val="26"/>
-        </w:rPr>
-        <w:t>JHON PAULO V. GASCON</w:t>
-        <w:br/>
-      </w:r>
-      <w:r>
-        <w:rPr>
-          <w:rFonts w:ascii="Calibri" w:hAnsi="Calibri"/>
-          <w:color w:val="4A5568"/>
-          <w:sz w:val="20"/>
-        </w:rPr>
-        <w:t>Bachelor of Science in Information Technology (BSIT)</w:t>
+        <w:t>STI West Negros University</w:t>
         <w:br/>
         <w:t>Bacolod City, Philippines</w:t>
         <w:br/>
-        <w:t>October 2026</w:t>
+        <w:t>Academic Year 2026–2027</w:t>
       </w:r>
     </w:p>
     <w:p>
@@ -120,98 +61,30 @@
     </w:p>
     <w:p>
       <w:pPr>
-        <w:sectPr>
-          <w:headerReference w:type="default" r:id="rId9"/>
-          <w:footerReference w:type="default" r:id="rId10"/>
-          <w:pgSz w:w="12240" w:h="15840"/>
-          <w:pgMar w:top="1440" w:right="1440" w:bottom="1440" w:left="1440" w:header="720" w:footer="720" w:gutter="0"/>
-          <w:cols w:space="720"/>
-          <w:titlePg/>
-          <w:docGrid w:linePitch="360"/>
-        </w:sectPr>
-      </w:pPr>
-    </w:p>
-    <w:p>
-      <w:pPr>
         <w:keepNext/>
-        <w:spacing w:before="360" w:after="120"/>
+        <w:spacing w:before="280" w:after="120"/>
       </w:pPr>
       <w:r>
         <w:rPr>
           <w:rFonts w:ascii="Calibri" w:hAnsi="Calibri"/>
           <w:b/>
-          <w:color w:val="78350F"/>
-          <w:sz w:val="32"/>
+          <w:color w:val="6B3A19"/>
+          <w:sz w:val="30"/>
         </w:rPr>
-        <w:t>Executive Summary</w:t>
+        <w:t>1. Executive Summary &amp; Concept Rationale</w:t>
       </w:r>
     </w:p>
     <w:p>
       <w:pPr>
-        <w:spacing w:before="0" w:after="140" w:line="276" w:lineRule="auto"/>
+        <w:spacing w:before="0" w:after="120" w:line="276" w:lineRule="auto"/>
       </w:pPr>
       <w:r>
         <w:rPr>
           <w:rFonts w:ascii="Calibri" w:hAnsi="Calibri"/>
-          <w:color w:val="2D3748"/>
-          <w:sz w:val="22"/>
+          <w:color w:val="2D2D2D"/>
+          <w:sz w:val="21"/>
         </w:rPr>
-        <w:t>Brewed Horizon is an artisanal, fast-service mobile coffee enterprise designed specifically for the student and faculty demographic at STI West Negros University. By offering high-quality Negros-sourced robusta and arabica blends at affordable student price points (P45 to P85), the venture bridges the gap between commercial instant sachets and expensive off-campus coffee shops. With an initial capital expenditure of P120,000, Brewed Horizon projects operational profitability within its third operating month.</w:t>
-      </w:r>
-    </w:p>
-    <w:p>
-      <w:pPr>
-        <w:keepNext/>
-        <w:spacing w:before="360" w:after="120"/>
-      </w:pPr>
-      <w:r>
-        <w:rPr>
-          <w:rFonts w:ascii="Calibri" w:hAnsi="Calibri"/>
-          <w:b/>
-          <w:color w:val="78350F"/>
-          <w:sz w:val="32"/>
-        </w:rPr>
-        <w:t>1. Market Opportunity and Competitive Advantage</w:t>
-      </w:r>
-    </w:p>
-    <w:p>
-      <w:pPr>
-        <w:spacing w:before="0" w:after="140" w:line="276" w:lineRule="auto"/>
-      </w:pPr>
-      <w:r>
-        <w:rPr>
-          <w:rFonts w:ascii="Calibri" w:hAnsi="Calibri"/>
-          <w:color w:val="2D3748"/>
-          <w:sz w:val="22"/>
-        </w:rPr>
-        <w:t>The campus population exceeds 4,500 enrolled students and staff with high daily demand for caffeinated beverages during early morning class blocks and late afternoon programming laboratories. Current options are restricted to university cafeteria instant dispensers and external cafes located three blocks away across congested thoroughfares.</w:t>
-      </w:r>
-    </w:p>
-    <w:p>
-      <w:pPr>
-        <w:keepNext/>
-        <w:spacing w:before="240" w:after="80"/>
-      </w:pPr>
-      <w:r>
-        <w:rPr>
-          <w:rFonts w:ascii="Calibri" w:hAnsi="Calibri"/>
-          <w:b/>
-          <w:color w:val="78350F"/>
-          <w:sz w:val="26"/>
-        </w:rPr>
-        <w:t>1.1 Competitor Benchmarking</w:t>
-      </w:r>
-    </w:p>
-    <w:p>
-      <w:pPr>
-        <w:spacing w:before="160" w:after="80"/>
-      </w:pPr>
-      <w:r>
-        <w:rPr>
-          <w:b/>
-          <w:sz w:val="20"/>
-        </w:rPr>
-        <w:t>Table 1. Campus Beverage Competitive Landscape Matrix</w:t>
+        <w:t>The Campus Coffee Cart is a mobile, high-efficiency specialty beverage kiosk designed specifically for the collegiate environment at STI West Negros University. By bridging the gap between premium third-wave coffee quality and student-friendly pricing, the business targets early-morning commuters, exam-season study groups, and faculty members seeking swift service without leaving campus grounds.</w:t>
       </w:r>
     </w:p>
     <w:tbl>
@@ -221,457 +94,46 @@
         <w:tblLook w:firstColumn="1" w:firstRow="1" w:lastColumn="0" w:lastRow="0" w:noHBand="0" w:noVBand="1" w:val="04A0"/>
       </w:tblPr>
       <w:tblGrid>
-        <w:gridCol w:w="2340"/>
-        <w:gridCol w:w="2340"/>
-        <w:gridCol w:w="2340"/>
-        <w:gridCol w:w="2340"/>
+        <w:gridCol w:w="9029"/>
       </w:tblGrid>
       <w:tr>
         <w:tc>
           <w:tcPr>
-            <w:tcW w:type="dxa" w:w="2592"/>
-            <w:shd w:fill="78350F"/>
+            <w:tcW w:type="dxa" w:w="9029"/>
+            <w:shd w:fill="FDF8F6"/>
             <w:tcMar>
               <w:top w:w="140" w:type="dxa"/>
               <w:bottom w:w="140" w:type="dxa"/>
-              <w:left w:w="180" w:type="dxa"/>
-              <w:right w:w="180" w:type="dxa"/>
+              <w:left w:w="200" w:type="dxa"/>
+              <w:right w:w="160" w:type="dxa"/>
             </w:tcMar>
+            <w:tcBorders>
+              <w:left w:val="single" w:sz="24" w:space="0" w:color="6B3A19"/>
+              <w:top w:val="none"/>
+              <w:right w:val="none"/>
+              <w:bottom w:val="none"/>
+            </w:tcBorders>
           </w:tcPr>
           <w:p>
             <w:pPr>
-              <w:jc w:val="left"/>
+              <w:spacing w:before="40" w:after="40"/>
             </w:pPr>
             <w:r>
               <w:rPr>
                 <w:rFonts w:ascii="Calibri" w:hAnsi="Calibri"/>
                 <w:b/>
-                <w:color w:val="FFFFFF"/>
+                <w:color w:val="6B3A19"/>
                 <w:sz w:val="20"/>
               </w:rPr>
-              <w:t>Provider Option</w:t>
-            </w:r>
-          </w:p>
-        </w:tc>
-        <w:tc>
-          <w:tcPr>
-            <w:tcW w:type="dxa" w:w="2016"/>
-            <w:shd w:fill="78350F"/>
-            <w:tcMar>
-              <w:top w:w="140" w:type="dxa"/>
-              <w:bottom w:w="140" w:type="dxa"/>
-              <w:left w:w="180" w:type="dxa"/>
-              <w:right w:w="180" w:type="dxa"/>
-            </w:tcMar>
-          </w:tcPr>
-          <w:p>
-            <w:pPr>
-              <w:jc w:val="left"/>
-            </w:pPr>
-            <w:r>
-              <w:rPr>
-                <w:rFonts w:ascii="Calibri" w:hAnsi="Calibri"/>
-                <w:b/>
-                <w:color w:val="FFFFFF"/>
-                <w:sz w:val="20"/>
-              </w:rPr>
-              <w:t>Average Price</w:t>
-            </w:r>
-          </w:p>
-        </w:tc>
-        <w:tc>
-          <w:tcPr>
-            <w:tcW w:type="dxa" w:w="2016"/>
-            <w:shd w:fill="78350F"/>
-            <w:tcMar>
-              <w:top w:w="140" w:type="dxa"/>
-              <w:bottom w:w="140" w:type="dxa"/>
-              <w:left w:w="180" w:type="dxa"/>
-              <w:right w:w="180" w:type="dxa"/>
-            </w:tcMar>
-          </w:tcPr>
-          <w:p>
-            <w:pPr>
-              <w:jc w:val="left"/>
-            </w:pPr>
-            <w:r>
-              <w:rPr>
-                <w:rFonts w:ascii="Calibri" w:hAnsi="Calibri"/>
-                <w:b/>
-                <w:color w:val="FFFFFF"/>
-                <w:sz w:val="20"/>
-              </w:rPr>
-              <w:t>Wait Time</w:t>
-            </w:r>
-          </w:p>
-        </w:tc>
-        <w:tc>
-          <w:tcPr>
-            <w:tcW w:type="dxa" w:w="2736"/>
-            <w:shd w:fill="78350F"/>
-            <w:tcMar>
-              <w:top w:w="140" w:type="dxa"/>
-              <w:bottom w:w="140" w:type="dxa"/>
-              <w:left w:w="180" w:type="dxa"/>
-              <w:right w:w="180" w:type="dxa"/>
-            </w:tcMar>
-          </w:tcPr>
-          <w:p>
-            <w:pPr>
-              <w:jc w:val="left"/>
-            </w:pPr>
-            <w:r>
-              <w:rPr>
-                <w:rFonts w:ascii="Calibri" w:hAnsi="Calibri"/>
-                <w:b/>
-                <w:color w:val="FFFFFF"/>
-                <w:sz w:val="20"/>
-              </w:rPr>
-              <w:t>Value Proposition</w:t>
-            </w:r>
-          </w:p>
-        </w:tc>
-      </w:tr>
-      <w:tr>
-        <w:tc>
-          <w:tcPr>
-            <w:tcW w:type="dxa" w:w="2592"/>
-            <w:shd w:fill="FFFFFF"/>
-            <w:tcMar>
-              <w:top w:w="120" w:type="dxa"/>
-              <w:bottom w:w="120" w:type="dxa"/>
-              <w:left w:w="180" w:type="dxa"/>
-              <w:right w:w="180" w:type="dxa"/>
-            </w:tcMar>
-          </w:tcPr>
-          <w:p>
-            <w:r>
-              <w:rPr>
-                <w:rFonts w:ascii="Calibri" w:hAnsi="Calibri"/>
-                <w:color w:val="2D3748"/>
-                <w:sz w:val="19"/>
-              </w:rPr>
-              <w:t>Campus Canteen Instant</w:t>
-            </w:r>
-          </w:p>
-        </w:tc>
-        <w:tc>
-          <w:tcPr>
-            <w:tcW w:type="dxa" w:w="2016"/>
-            <w:shd w:fill="FFFFFF"/>
-            <w:tcMar>
-              <w:top w:w="120" w:type="dxa"/>
-              <w:bottom w:w="120" w:type="dxa"/>
-              <w:left w:w="180" w:type="dxa"/>
-              <w:right w:w="180" w:type="dxa"/>
-            </w:tcMar>
-          </w:tcPr>
-          <w:p>
-            <w:r>
-              <w:rPr>
-                <w:rFonts w:ascii="Calibri" w:hAnsi="Calibri"/>
-                <w:color w:val="2D3748"/>
-                <w:sz w:val="19"/>
-              </w:rPr>
-              <w:t>P20.00 – P25.00</w:t>
-            </w:r>
-          </w:p>
-        </w:tc>
-        <w:tc>
-          <w:tcPr>
-            <w:tcW w:type="dxa" w:w="2016"/>
-            <w:shd w:fill="FFFFFF"/>
-            <w:tcMar>
-              <w:top w:w="120" w:type="dxa"/>
-              <w:bottom w:w="120" w:type="dxa"/>
-              <w:left w:w="180" w:type="dxa"/>
-              <w:right w:w="180" w:type="dxa"/>
-            </w:tcMar>
-          </w:tcPr>
-          <w:p>
-            <w:r>
-              <w:rPr>
-                <w:rFonts w:ascii="Calibri" w:hAnsi="Calibri"/>
-                <w:color w:val="2D3748"/>
-                <w:sz w:val="19"/>
-              </w:rPr>
-              <w:t>Instant</w:t>
-            </w:r>
-          </w:p>
-        </w:tc>
-        <w:tc>
-          <w:tcPr>
-            <w:tcW w:type="dxa" w:w="2736"/>
-            <w:shd w:fill="FFFFFF"/>
-            <w:tcMar>
-              <w:top w:w="120" w:type="dxa"/>
-              <w:bottom w:w="120" w:type="dxa"/>
-              <w:left w:w="180" w:type="dxa"/>
-              <w:right w:w="180" w:type="dxa"/>
-            </w:tcMar>
-          </w:tcPr>
-          <w:p>
-            <w:r>
-              <w:rPr>
-                <w:rFonts w:ascii="Calibri" w:hAnsi="Calibri"/>
-                <w:color w:val="2D3748"/>
-                <w:sz w:val="19"/>
-              </w:rPr>
-              <w:t>Low cost, powdered sachets, limited flavor</w:t>
-            </w:r>
-          </w:p>
-        </w:tc>
-      </w:tr>
-      <w:tr>
-        <w:tc>
-          <w:tcPr>
-            <w:tcW w:type="dxa" w:w="2592"/>
-            <w:shd w:fill="FEF3C7"/>
-            <w:tcMar>
-              <w:top w:w="120" w:type="dxa"/>
-              <w:bottom w:w="120" w:type="dxa"/>
-              <w:left w:w="180" w:type="dxa"/>
-              <w:right w:w="180" w:type="dxa"/>
-            </w:tcMar>
-          </w:tcPr>
-          <w:p>
-            <w:r>
-              <w:rPr>
-                <w:rFonts w:ascii="Calibri" w:hAnsi="Calibri"/>
-                <w:color w:val="2D3748"/>
-                <w:sz w:val="19"/>
-              </w:rPr>
-              <w:t>External Commercial Cafes</w:t>
-            </w:r>
-          </w:p>
-        </w:tc>
-        <w:tc>
-          <w:tcPr>
-            <w:tcW w:type="dxa" w:w="2016"/>
-            <w:shd w:fill="FEF3C7"/>
-            <w:tcMar>
-              <w:top w:w="120" w:type="dxa"/>
-              <w:bottom w:w="120" w:type="dxa"/>
-              <w:left w:w="180" w:type="dxa"/>
-              <w:right w:w="180" w:type="dxa"/>
-            </w:tcMar>
-          </w:tcPr>
-          <w:p>
-            <w:r>
-              <w:rPr>
-                <w:rFonts w:ascii="Calibri" w:hAnsi="Calibri"/>
-                <w:color w:val="2D3748"/>
-                <w:sz w:val="19"/>
-              </w:rPr>
-              <w:t>P130.00 – P180.00</w:t>
-            </w:r>
-          </w:p>
-        </w:tc>
-        <w:tc>
-          <w:tcPr>
-            <w:tcW w:type="dxa" w:w="2016"/>
-            <w:shd w:fill="FEF3C7"/>
-            <w:tcMar>
-              <w:top w:w="120" w:type="dxa"/>
-              <w:bottom w:w="120" w:type="dxa"/>
-              <w:left w:w="180" w:type="dxa"/>
-              <w:right w:w="180" w:type="dxa"/>
-            </w:tcMar>
-          </w:tcPr>
-          <w:p>
-            <w:r>
-              <w:rPr>
-                <w:rFonts w:ascii="Calibri" w:hAnsi="Calibri"/>
-                <w:color w:val="2D3748"/>
-                <w:sz w:val="19"/>
-              </w:rPr>
-              <w:t>12–15 Minutes</w:t>
-            </w:r>
-          </w:p>
-        </w:tc>
-        <w:tc>
-          <w:tcPr>
-            <w:tcW w:type="dxa" w:w="2736"/>
-            <w:shd w:fill="FEF3C7"/>
-            <w:tcMar>
-              <w:top w:w="120" w:type="dxa"/>
-              <w:bottom w:w="120" w:type="dxa"/>
-              <w:left w:w="180" w:type="dxa"/>
-              <w:right w:w="180" w:type="dxa"/>
-            </w:tcMar>
-          </w:tcPr>
-          <w:p>
-            <w:r>
-              <w:rPr>
-                <w:rFonts w:ascii="Calibri" w:hAnsi="Calibri"/>
-                <w:color w:val="2D3748"/>
-                <w:sz w:val="19"/>
-              </w:rPr>
-              <w:t>Premium seating, excessive price for daily budget</w:t>
-            </w:r>
-          </w:p>
-        </w:tc>
-      </w:tr>
-      <w:tr>
-        <w:tc>
-          <w:tcPr>
-            <w:tcW w:type="dxa" w:w="2592"/>
-            <w:shd w:fill="FFFFFF"/>
-            <w:tcMar>
-              <w:top w:w="120" w:type="dxa"/>
-              <w:bottom w:w="120" w:type="dxa"/>
-              <w:left w:w="180" w:type="dxa"/>
-              <w:right w:w="180" w:type="dxa"/>
-            </w:tcMar>
-          </w:tcPr>
-          <w:p>
-            <w:r>
-              <w:rPr>
-                <w:rFonts w:ascii="Calibri" w:hAnsi="Calibri"/>
-                <w:color w:val="2D3748"/>
-                <w:sz w:val="19"/>
-              </w:rPr>
-              <w:t>Brewed Horizon Cart</w:t>
-            </w:r>
-          </w:p>
-        </w:tc>
-        <w:tc>
-          <w:tcPr>
-            <w:tcW w:type="dxa" w:w="2016"/>
-            <w:shd w:fill="FFFFFF"/>
-            <w:tcMar>
-              <w:top w:w="120" w:type="dxa"/>
-              <w:bottom w:w="120" w:type="dxa"/>
-              <w:left w:w="180" w:type="dxa"/>
-              <w:right w:w="180" w:type="dxa"/>
-            </w:tcMar>
-          </w:tcPr>
-          <w:p>
-            <w:r>
-              <w:rPr>
-                <w:rFonts w:ascii="Calibri" w:hAnsi="Calibri"/>
-                <w:color w:val="2D3748"/>
-                <w:sz w:val="19"/>
-              </w:rPr>
-              <w:t>P45.00 – P75.00</w:t>
-            </w:r>
-          </w:p>
-        </w:tc>
-        <w:tc>
-          <w:tcPr>
-            <w:tcW w:type="dxa" w:w="2016"/>
-            <w:shd w:fill="FFFFFF"/>
-            <w:tcMar>
-              <w:top w:w="120" w:type="dxa"/>
-              <w:bottom w:w="120" w:type="dxa"/>
-              <w:left w:w="180" w:type="dxa"/>
-              <w:right w:w="180" w:type="dxa"/>
-            </w:tcMar>
-          </w:tcPr>
-          <w:p>
-            <w:r>
-              <w:rPr>
-                <w:rFonts w:ascii="Calibri" w:hAnsi="Calibri"/>
-                <w:color w:val="2D3748"/>
-                <w:sz w:val="19"/>
-              </w:rPr>
-              <w:t>2–3 Minutes</w:t>
-            </w:r>
-          </w:p>
-        </w:tc>
-        <w:tc>
-          <w:tcPr>
-            <w:tcW w:type="dxa" w:w="2736"/>
-            <w:shd w:fill="FFFFFF"/>
-            <w:tcMar>
-              <w:top w:w="120" w:type="dxa"/>
-              <w:bottom w:w="120" w:type="dxa"/>
-              <w:left w:w="180" w:type="dxa"/>
-              <w:right w:w="180" w:type="dxa"/>
-            </w:tcMar>
-          </w:tcPr>
-          <w:p>
-            <w:r>
-              <w:rPr>
-                <w:rFonts w:ascii="Calibri" w:hAnsi="Calibri"/>
-                <w:color w:val="2D3748"/>
-                <w:sz w:val="19"/>
-              </w:rPr>
-              <w:t>Freshly brewed local beans, student discounts, speed</w:t>
-            </w:r>
-          </w:p>
-        </w:tc>
-      </w:tr>
-    </w:tbl>
-    <w:p>
-      <w:pPr>
-        <w:keepNext/>
-        <w:spacing w:before="360" w:after="120"/>
-      </w:pPr>
-      <w:r>
-        <w:rPr>
-          <w:rFonts w:ascii="Calibri" w:hAnsi="Calibri"/>
-          <w:b/>
-          <w:color w:val="78350F"/>
-          <w:sz w:val="32"/>
-        </w:rPr>
-        <w:t>2. Product Line and Operational Workflow</w:t>
-      </w:r>
-    </w:p>
-    <w:p>
-      <w:pPr>
-        <w:spacing w:before="0" w:after="140" w:line="276" w:lineRule="auto"/>
-      </w:pPr>
-      <w:r>
-        <w:rPr>
-          <w:rFonts w:ascii="Calibri" w:hAnsi="Calibri"/>
-          <w:color w:val="2D3748"/>
-          <w:sz w:val="22"/>
-        </w:rPr>
-        <w:t>The cart features four signature core offerings: Kape Barako Americano, Sweetened condensed milk Spanish Latte, Iced Matcha Fusion, and Cold Brew Concentrate. Equipment includes dual commercial semi-automatic espresso extractors, solar-assisted battery invertors for grinder power, and insulated beverage dispensers.</w:t>
-      </w:r>
-    </w:p>
-    <w:tbl>
-      <w:tblPr>
-        <w:tblW w:type="auto" w:w="0"/>
-        <w:jc w:val="center"/>
-        <w:tblLook w:firstColumn="1" w:firstRow="1" w:lastColumn="0" w:lastRow="0" w:noHBand="0" w:noVBand="1" w:val="04A0"/>
-      </w:tblPr>
-      <w:tblGrid>
-        <w:gridCol w:w="9360"/>
-      </w:tblGrid>
-      <w:tr>
-        <w:tc>
-          <w:tcPr>
-            <w:tcW w:type="dxa" w:w="9360"/>
-            <w:shd w:fill="FFFBEB"/>
-            <w:tcMar>
-              <w:top w:w="140" w:type="dxa"/>
-              <w:bottom w:w="140" w:type="dxa"/>
-              <w:left w:w="180" w:type="dxa"/>
-              <w:right w:w="180" w:type="dxa"/>
-            </w:tcMar>
-          </w:tcPr>
-          <w:p>
-            <w:pPr>
-              <w:spacing w:after="40"/>
-            </w:pPr>
-            <w:r>
-              <w:rPr>
-                <w:rFonts w:ascii="Calibri" w:hAnsi="Calibri"/>
-                <w:b/>
-                <w:color w:val="1E3A8A"/>
-                <w:sz w:val="20"/>
-              </w:rPr>
-              <w:t xml:space="preserve">STRATEGIC SUPPLY CHAIN ADVANTAGE: </w:t>
+              <w:t xml:space="preserve">KEY DEFINITION — Value Proposition: </w:t>
             </w:r>
             <w:r>
               <w:rPr>
                 <w:rFonts w:ascii="Calibri" w:hAnsi="Calibri"/>
-                <w:color w:val="1E293B"/>
+                <w:color w:val="323232"/>
                 <w:sz w:val="20"/>
               </w:rPr>
-              <w:t>By partnering with organic coffee cooperatives in Canlaon and northern Negros, supply costs are reduced by 22% while guaranteeing farm-fresh single-origin roast profiles.</w:t>
+              <w:t>High-speed espresso extraction in under 60 seconds, localized Negros-sourced coffee beans, cashless QR payments, and sustainable biodegradable cups.</w:t>
             </w:r>
           </w:p>
         </w:tc>
@@ -685,69 +147,189 @@
     <w:p>
       <w:pPr>
         <w:keepNext/>
-        <w:spacing w:before="360" w:after="120"/>
+        <w:spacing w:before="200" w:after="80"/>
       </w:pPr>
       <w:r>
         <w:rPr>
           <w:rFonts w:ascii="Calibri" w:hAnsi="Calibri"/>
           <w:b/>
-          <w:color w:val="78350F"/>
-          <w:sz w:val="32"/>
+          <w:color w:val="6B3A19"/>
+          <w:sz w:val="25"/>
         </w:rPr>
-        <w:t>3. Staffing, Logistics, and Sanitation Standards</w:t>
+        <w:t>Operational Workflow Architecture</w:t>
       </w:r>
     </w:p>
     <w:p>
       <w:pPr>
-        <w:spacing w:before="0" w:after="140" w:line="276" w:lineRule="auto"/>
+        <w:spacing w:before="0" w:after="120" w:line="276" w:lineRule="auto"/>
       </w:pPr>
       <w:r>
         <w:rPr>
           <w:rFonts w:ascii="Calibri" w:hAnsi="Calibri"/>
-          <w:color w:val="2D3748"/>
-          <w:sz w:val="22"/>
+          <w:color w:val="2D2D2D"/>
+          <w:sz w:val="21"/>
         </w:rPr>
-        <w:t>Staffing will utilize student interns under working-scholar arrangements, offering fair hourly stipends and schedule flexibility around college lectures. Daily operations adhere strictly to Bacolod City sanitary permit requirements, including food-grade stainless steel surfaces, potable water carboys, and biodegradable sugarcane-bagasse cups.</w:t>
+        <w:t>The cart features a streamlined linear workflow to ensure zero bottlenecking during peak 15-minute class changeover intervals:</w:t>
       </w:r>
     </w:p>
     <w:p>
       <w:pPr>
         <w:keepNext/>
-        <w:spacing w:before="360" w:after="120"/>
+        <w:spacing w:before="160" w:after="80"/>
+        <w:jc w:val="center"/>
+      </w:pPr>
+      <w:r>
+        <w:drawing>
+          <wp:inline xmlns:a="http://schemas.openxmlformats.org/drawingml/2006/main" xmlns:pic="http://schemas.openxmlformats.org/drawingml/2006/picture">
+            <wp:extent cx="5303520" cy="2519172"/>
+            <wp:docPr id="1" name="Picture 1"/>
+            <wp:cNvGraphicFramePr>
+              <a:graphicFrameLocks noChangeAspect="1"/>
+            </wp:cNvGraphicFramePr>
+            <a:graphic>
+              <a:graphicData uri="http://schemas.openxmlformats.org/drawingml/2006/picture">
+                <pic:pic>
+                  <pic:nvPicPr>
+                    <pic:cNvPr id="0" name="coffee_cart_workflow.png"/>
+                    <pic:cNvPicPr/>
+                  </pic:nvPicPr>
+                  <pic:blipFill>
+                    <a:blip r:embed="rId9"/>
+                    <a:stretch>
+                      <a:fillRect/>
+                    </a:stretch>
+                  </pic:blipFill>
+                  <pic:spPr>
+                    <a:xfrm>
+                      <a:off x="0" y="0"/>
+                      <a:ext cx="5303520" cy="2519172"/>
+                    </a:xfrm>
+                    <a:prstGeom prst="rect"/>
+                  </pic:spPr>
+                </pic:pic>
+              </a:graphicData>
+            </a:graphic>
+          </wp:inline>
+        </w:drawing>
+      </w:r>
+    </w:p>
+    <w:p>
+      <w:pPr>
+        <w:spacing w:before="40" w:after="200"/>
+        <w:jc w:val="center"/>
+      </w:pPr>
+      <w:r>
+        <w:rPr>
+          <w:rFonts w:ascii="Calibri" w:hAnsi="Calibri"/>
+          <w:i/>
+          <w:color w:val="646464"/>
+          <w:sz w:val="19"/>
+        </w:rPr>
+        <w:t>Figure 1: Campus Cart Workflow &amp; POS Order Fulfillment Blueprint.</w:t>
+      </w:r>
+    </w:p>
+    <w:p>
+      <w:r>
+        <w:br w:type="page"/>
+      </w:r>
+    </w:p>
+    <w:p>
+      <w:pPr>
+        <w:keepNext/>
+        <w:spacing w:before="280" w:after="120"/>
       </w:pPr>
       <w:r>
         <w:rPr>
           <w:rFonts w:ascii="Calibri" w:hAnsi="Calibri"/>
           <w:b/>
-          <w:color w:val="78350F"/>
-          <w:sz w:val="32"/>
+          <w:color w:val="6B3A19"/>
+          <w:sz w:val="30"/>
         </w:rPr>
-        <w:t>4. Financial Projections and Budget Outlay</w:t>
+        <w:t>2. 12-Month Financial Projections &amp; Unit Economics</w:t>
       </w:r>
     </w:p>
     <w:p>
       <w:pPr>
-        <w:spacing w:before="0" w:after="140" w:line="276" w:lineRule="auto"/>
+        <w:spacing w:before="0" w:after="120" w:line="276" w:lineRule="auto"/>
       </w:pPr>
       <w:r>
         <w:rPr>
           <w:rFonts w:ascii="Calibri" w:hAnsi="Calibri"/>
-          <w:color w:val="2D3748"/>
-          <w:sz w:val="22"/>
+          <w:color w:val="2D2D2D"/>
+          <w:sz w:val="21"/>
         </w:rPr>
-        <w:t>Financial models assume a conservative baseline of 120 cups sold daily during peak semester periods (22 operating days per month). Capital outlay is allocated across cart fabrication (P45,000), espresso equipment (P50,000), initial inventory (P15,000), and operating permits (P10,000).</w:t>
+        <w:t>With an initial capital expenditure of ₱120,000 covering commercial espresso machinery, mobile chassis fabrication, and initial inventory, the business achieves operational break-even by Month 2, accelerating to substantial net operating margins by mid-year.</w:t>
       </w:r>
     </w:p>
     <w:p>
       <w:pPr>
+        <w:keepNext/>
         <w:spacing w:before="160" w:after="80"/>
+        <w:jc w:val="center"/>
+      </w:pPr>
+      <w:r>
+        <w:drawing>
+          <wp:inline xmlns:a="http://schemas.openxmlformats.org/drawingml/2006/main" xmlns:pic="http://schemas.openxmlformats.org/drawingml/2006/picture">
+            <wp:extent cx="5303520" cy="2784348"/>
+            <wp:docPr id="2" name="Picture 2"/>
+            <wp:cNvGraphicFramePr>
+              <a:graphicFrameLocks noChangeAspect="1"/>
+            </wp:cNvGraphicFramePr>
+            <a:graphic>
+              <a:graphicData uri="http://schemas.openxmlformats.org/drawingml/2006/picture">
+                <pic:pic>
+                  <pic:nvPicPr>
+                    <pic:cNvPr id="0" name="coffee_cart_financials.png"/>
+                    <pic:cNvPicPr/>
+                  </pic:nvPicPr>
+                  <pic:blipFill>
+                    <a:blip r:embed="rId10"/>
+                    <a:stretch>
+                      <a:fillRect/>
+                    </a:stretch>
+                  </pic:blipFill>
+                  <pic:spPr>
+                    <a:xfrm>
+                      <a:off x="0" y="0"/>
+                      <a:ext cx="5303520" cy="2784348"/>
+                    </a:xfrm>
+                    <a:prstGeom prst="rect"/>
+                  </pic:spPr>
+                </pic:pic>
+              </a:graphicData>
+            </a:graphic>
+          </wp:inline>
+        </w:drawing>
+      </w:r>
+    </w:p>
+    <w:p>
+      <w:pPr>
+        <w:spacing w:before="40" w:after="200"/>
+        <w:jc w:val="center"/>
       </w:pPr>
       <w:r>
         <w:rPr>
+          <w:rFonts w:ascii="Calibri" w:hAnsi="Calibri"/>
+          <w:i/>
+          <w:color w:val="646464"/>
+          <w:sz w:val="19"/>
+        </w:rPr>
+        <w:t>Figure 2: 12-Month Projected Revenue, Expenses, and Net Margin Curve.</w:t>
+      </w:r>
+    </w:p>
+    <w:p>
+      <w:pPr>
+        <w:keepNext/>
+        <w:spacing w:before="200" w:after="80"/>
+      </w:pPr>
+      <w:r>
+        <w:rPr>
+          <w:rFonts w:ascii="Calibri" w:hAnsi="Calibri"/>
           <w:b/>
-          <w:sz w:val="20"/>
+          <w:color w:val="6B3A19"/>
+          <w:sz w:val="25"/>
         </w:rPr>
-        <w:t>Table 2. 12-Month Projected Income Statement Summary</w:t>
+        <w:t>Core Menu Unit Economics</w:t>
       </w:r>
     </w:p>
     <w:tbl>
@@ -757,113 +339,97 @@
         <w:tblLook w:firstColumn="1" w:firstRow="1" w:lastColumn="0" w:lastRow="0" w:noHBand="0" w:noVBand="1" w:val="04A0"/>
       </w:tblPr>
       <w:tblGrid>
-        <w:gridCol w:w="2340"/>
-        <w:gridCol w:w="2340"/>
-        <w:gridCol w:w="2340"/>
-        <w:gridCol w:w="2340"/>
+        <w:gridCol w:w="2257"/>
+        <w:gridCol w:w="2257"/>
+        <w:gridCol w:w="2257"/>
+        <w:gridCol w:w="2257"/>
       </w:tblGrid>
       <w:tr>
         <w:tc>
           <w:tcPr>
-            <w:tcW w:type="dxa" w:w="2880"/>
-            <w:shd w:fill="78350F"/>
+            <w:tcW w:type="dxa" w:w="2257"/>
+            <w:shd w:fill="6B3A19"/>
             <w:tcMar>
-              <w:top w:w="140" w:type="dxa"/>
-              <w:bottom w:w="140" w:type="dxa"/>
-              <w:left w:w="180" w:type="dxa"/>
-              <w:right w:w="180" w:type="dxa"/>
+              <w:top w:w="80" w:type="dxa"/>
+              <w:bottom w:w="80" w:type="dxa"/>
+              <w:left w:w="100" w:type="dxa"/>
+              <w:right w:w="100" w:type="dxa"/>
             </w:tcMar>
           </w:tcPr>
           <w:p>
-            <w:pPr>
-              <w:jc w:val="left"/>
-            </w:pPr>
             <w:r>
               <w:rPr>
-                <w:rFonts w:ascii="Calibri" w:hAnsi="Calibri"/>
                 <w:b/>
                 <w:color w:val="FFFFFF"/>
-                <w:sz w:val="20"/>
+                <w:sz w:val="19"/>
               </w:rPr>
-              <w:t>Operating Metric</w:t>
+              <w:t>Product Item</w:t>
             </w:r>
           </w:p>
         </w:tc>
         <w:tc>
           <w:tcPr>
-            <w:tcW w:type="dxa" w:w="2016"/>
-            <w:shd w:fill="78350F"/>
+            <w:tcW w:type="dxa" w:w="2257"/>
+            <w:shd w:fill="6B3A19"/>
             <w:tcMar>
-              <w:top w:w="140" w:type="dxa"/>
-              <w:bottom w:w="140" w:type="dxa"/>
-              <w:left w:w="180" w:type="dxa"/>
-              <w:right w:w="180" w:type="dxa"/>
+              <w:top w:w="80" w:type="dxa"/>
+              <w:bottom w:w="80" w:type="dxa"/>
+              <w:left w:w="100" w:type="dxa"/>
+              <w:right w:w="100" w:type="dxa"/>
             </w:tcMar>
           </w:tcPr>
           <w:p>
-            <w:pPr>
-              <w:jc w:val="left"/>
-            </w:pPr>
             <w:r>
               <w:rPr>
-                <w:rFonts w:ascii="Calibri" w:hAnsi="Calibri"/>
                 <w:b/>
                 <w:color w:val="FFFFFF"/>
-                <w:sz w:val="20"/>
+                <w:sz w:val="19"/>
               </w:rPr>
-              <w:t>Quarter 1</w:t>
+              <w:t>COGS (₱)</w:t>
             </w:r>
           </w:p>
         </w:tc>
         <w:tc>
           <w:tcPr>
-            <w:tcW w:type="dxa" w:w="2016"/>
-            <w:shd w:fill="78350F"/>
+            <w:tcW w:type="dxa" w:w="2257"/>
+            <w:shd w:fill="6B3A19"/>
             <w:tcMar>
-              <w:top w:w="140" w:type="dxa"/>
-              <w:bottom w:w="140" w:type="dxa"/>
-              <w:left w:w="180" w:type="dxa"/>
-              <w:right w:w="180" w:type="dxa"/>
+              <w:top w:w="80" w:type="dxa"/>
+              <w:bottom w:w="80" w:type="dxa"/>
+              <w:left w:w="100" w:type="dxa"/>
+              <w:right w:w="100" w:type="dxa"/>
             </w:tcMar>
           </w:tcPr>
           <w:p>
-            <w:pPr>
-              <w:jc w:val="left"/>
-            </w:pPr>
             <w:r>
               <w:rPr>
-                <w:rFonts w:ascii="Calibri" w:hAnsi="Calibri"/>
                 <w:b/>
                 <w:color w:val="FFFFFF"/>
-                <w:sz w:val="20"/>
+                <w:sz w:val="19"/>
               </w:rPr>
-              <w:t>Quarter 2</w:t>
+              <w:t>Retail Price (₱)</w:t>
             </w:r>
           </w:p>
         </w:tc>
         <w:tc>
           <w:tcPr>
-            <w:tcW w:type="dxa" w:w="2448"/>
-            <w:shd w:fill="78350F"/>
+            <w:tcW w:type="dxa" w:w="2257"/>
+            <w:shd w:fill="6B3A19"/>
             <w:tcMar>
-              <w:top w:w="140" w:type="dxa"/>
-              <w:bottom w:w="140" w:type="dxa"/>
-              <w:left w:w="180" w:type="dxa"/>
-              <w:right w:w="180" w:type="dxa"/>
+              <w:top w:w="80" w:type="dxa"/>
+              <w:bottom w:w="80" w:type="dxa"/>
+              <w:left w:w="100" w:type="dxa"/>
+              <w:right w:w="100" w:type="dxa"/>
             </w:tcMar>
           </w:tcPr>
           <w:p>
-            <w:pPr>
-              <w:jc w:val="left"/>
-            </w:pPr>
             <w:r>
               <w:rPr>
-                <w:rFonts w:ascii="Calibri" w:hAnsi="Calibri"/>
                 <w:b/>
                 <w:color w:val="FFFFFF"/>
-                <w:sz w:val="20"/>
+                <w:sz w:val="19"/>
               </w:rPr>
-              <w:t>Annual Total (Year 1)</w:t>
+              <w:t>Gross Margin (%)</w:t>
             </w:r>
           </w:p>
         </w:tc>
@@ -871,89 +437,85 @@
       <w:tr>
         <w:tc>
           <w:tcPr>
-            <w:tcW w:type="dxa" w:w="2880"/>
-            <w:shd w:fill="FFFFFF"/>
+            <w:tcW w:type="dxa" w:w="2257"/>
+            <w:shd w:fill="FDF8F6"/>
             <w:tcMar>
-              <w:top w:w="120" w:type="dxa"/>
-              <w:bottom w:w="120" w:type="dxa"/>
-              <w:left w:w="180" w:type="dxa"/>
-              <w:right w:w="180" w:type="dxa"/>
+              <w:top w:w="60" w:type="dxa"/>
+              <w:bottom w:w="60" w:type="dxa"/>
+              <w:left w:w="100" w:type="dxa"/>
+              <w:right w:w="100" w:type="dxa"/>
             </w:tcMar>
           </w:tcPr>
           <w:p>
             <w:r>
               <w:rPr>
-                <w:rFonts w:ascii="Calibri" w:hAnsi="Calibri"/>
-                <w:color w:val="2D3748"/>
+                <w:color w:val="282828"/>
                 <w:sz w:val="19"/>
               </w:rPr>
-              <w:t>Gross Beverage Sales</w:t>
+              <w:t>Iced Americano (16 oz)</w:t>
             </w:r>
           </w:p>
         </w:tc>
         <w:tc>
           <w:tcPr>
-            <w:tcW w:type="dxa" w:w="2016"/>
-            <w:shd w:fill="FFFFFF"/>
+            <w:tcW w:type="dxa" w:w="2257"/>
+            <w:shd w:fill="FDF8F6"/>
             <w:tcMar>
-              <w:top w:w="120" w:type="dxa"/>
-              <w:bottom w:w="120" w:type="dxa"/>
-              <w:left w:w="180" w:type="dxa"/>
-              <w:right w:w="180" w:type="dxa"/>
+              <w:top w:w="60" w:type="dxa"/>
+              <w:bottom w:w="60" w:type="dxa"/>
+              <w:left w:w="100" w:type="dxa"/>
+              <w:right w:w="100" w:type="dxa"/>
             </w:tcMar>
           </w:tcPr>
           <w:p>
             <w:r>
               <w:rPr>
-                <w:rFonts w:ascii="Calibri" w:hAnsi="Calibri"/>
-                <w:color w:val="2D3748"/>
+                <w:color w:val="282828"/>
                 <w:sz w:val="19"/>
               </w:rPr>
-              <w:t>P356,400</w:t>
+              <w:t>₱18.50</w:t>
             </w:r>
           </w:p>
         </w:tc>
         <w:tc>
           <w:tcPr>
-            <w:tcW w:type="dxa" w:w="2016"/>
-            <w:shd w:fill="FFFFFF"/>
+            <w:tcW w:type="dxa" w:w="2257"/>
+            <w:shd w:fill="FDF8F6"/>
             <w:tcMar>
-              <w:top w:w="120" w:type="dxa"/>
-              <w:bottom w:w="120" w:type="dxa"/>
-              <w:left w:w="180" w:type="dxa"/>
-              <w:right w:w="180" w:type="dxa"/>
+              <w:top w:w="60" w:type="dxa"/>
+              <w:bottom w:w="60" w:type="dxa"/>
+              <w:left w:w="100" w:type="dxa"/>
+              <w:right w:w="100" w:type="dxa"/>
             </w:tcMar>
           </w:tcPr>
           <w:p>
             <w:r>
               <w:rPr>
-                <w:rFonts w:ascii="Calibri" w:hAnsi="Calibri"/>
-                <w:color w:val="2D3748"/>
+                <w:color w:val="282828"/>
                 <w:sz w:val="19"/>
               </w:rPr>
-              <w:t>P412,500</w:t>
+              <w:t>₱55.00</w:t>
             </w:r>
           </w:p>
         </w:tc>
         <w:tc>
           <w:tcPr>
-            <w:tcW w:type="dxa" w:w="2448"/>
-            <w:shd w:fill="FFFFFF"/>
+            <w:tcW w:type="dxa" w:w="2257"/>
+            <w:shd w:fill="FDF8F6"/>
             <w:tcMar>
-              <w:top w:w="120" w:type="dxa"/>
-              <w:bottom w:w="120" w:type="dxa"/>
-              <w:left w:w="180" w:type="dxa"/>
-              <w:right w:w="180" w:type="dxa"/>
+              <w:top w:w="60" w:type="dxa"/>
+              <w:bottom w:w="60" w:type="dxa"/>
+              <w:left w:w="100" w:type="dxa"/>
+              <w:right w:w="100" w:type="dxa"/>
             </w:tcMar>
           </w:tcPr>
           <w:p>
             <w:r>
               <w:rPr>
-                <w:rFonts w:ascii="Calibri" w:hAnsi="Calibri"/>
-                <w:color w:val="2D3748"/>
+                <w:color w:val="282828"/>
                 <w:sz w:val="19"/>
               </w:rPr>
-              <w:t>P1,544,400</w:t>
+              <w:t>66.4%</w:t>
             </w:r>
           </w:p>
         </w:tc>
@@ -961,89 +523,85 @@
       <w:tr>
         <w:tc>
           <w:tcPr>
-            <w:tcW w:type="dxa" w:w="2880"/>
-            <w:shd w:fill="FEF3C7"/>
+            <w:tcW w:type="dxa" w:w="2257"/>
+            <w:shd w:fill="FFFFFF"/>
             <w:tcMar>
-              <w:top w:w="120" w:type="dxa"/>
-              <w:bottom w:w="120" w:type="dxa"/>
-              <w:left w:w="180" w:type="dxa"/>
-              <w:right w:w="180" w:type="dxa"/>
+              <w:top w:w="60" w:type="dxa"/>
+              <w:bottom w:w="60" w:type="dxa"/>
+              <w:left w:w="100" w:type="dxa"/>
+              <w:right w:w="100" w:type="dxa"/>
             </w:tcMar>
           </w:tcPr>
           <w:p>
             <w:r>
               <w:rPr>
-                <w:rFonts w:ascii="Calibri" w:hAnsi="Calibri"/>
-                <w:color w:val="2D3748"/>
+                <w:color w:val="282828"/>
                 <w:sz w:val="19"/>
               </w:rPr>
-              <w:t>Cost of Goods Sold (COGS)</w:t>
+              <w:t>Spanish Latte (16 oz)</w:t>
             </w:r>
           </w:p>
         </w:tc>
         <w:tc>
           <w:tcPr>
-            <w:tcW w:type="dxa" w:w="2016"/>
-            <w:shd w:fill="FEF3C7"/>
+            <w:tcW w:type="dxa" w:w="2257"/>
+            <w:shd w:fill="FFFFFF"/>
             <w:tcMar>
-              <w:top w:w="120" w:type="dxa"/>
-              <w:bottom w:w="120" w:type="dxa"/>
-              <w:left w:w="180" w:type="dxa"/>
-              <w:right w:w="180" w:type="dxa"/>
+              <w:top w:w="60" w:type="dxa"/>
+              <w:bottom w:w="60" w:type="dxa"/>
+              <w:left w:w="100" w:type="dxa"/>
+              <w:right w:w="100" w:type="dxa"/>
             </w:tcMar>
           </w:tcPr>
           <w:p>
             <w:r>
               <w:rPr>
-                <w:rFonts w:ascii="Calibri" w:hAnsi="Calibri"/>
-                <w:color w:val="2D3748"/>
+                <w:color w:val="282828"/>
                 <w:sz w:val="19"/>
               </w:rPr>
-              <w:t>P124,740</w:t>
+              <w:t>₱24.00</w:t>
             </w:r>
           </w:p>
         </w:tc>
         <w:tc>
           <w:tcPr>
-            <w:tcW w:type="dxa" w:w="2016"/>
-            <w:shd w:fill="FEF3C7"/>
+            <w:tcW w:type="dxa" w:w="2257"/>
+            <w:shd w:fill="FFFFFF"/>
             <w:tcMar>
-              <w:top w:w="120" w:type="dxa"/>
-              <w:bottom w:w="120" w:type="dxa"/>
-              <w:left w:w="180" w:type="dxa"/>
-              <w:right w:w="180" w:type="dxa"/>
+              <w:top w:w="60" w:type="dxa"/>
+              <w:bottom w:w="60" w:type="dxa"/>
+              <w:left w:w="100" w:type="dxa"/>
+              <w:right w:w="100" w:type="dxa"/>
             </w:tcMar>
           </w:tcPr>
           <w:p>
             <w:r>
               <w:rPr>
-                <w:rFonts w:ascii="Calibri" w:hAnsi="Calibri"/>
-                <w:color w:val="2D3748"/>
+                <w:color w:val="282828"/>
                 <w:sz w:val="19"/>
               </w:rPr>
-              <w:t>P144,375</w:t>
+              <w:t>₱75.00</w:t>
             </w:r>
           </w:p>
         </w:tc>
         <w:tc>
           <w:tcPr>
-            <w:tcW w:type="dxa" w:w="2448"/>
-            <w:shd w:fill="FEF3C7"/>
+            <w:tcW w:type="dxa" w:w="2257"/>
+            <w:shd w:fill="FFFFFF"/>
             <w:tcMar>
-              <w:top w:w="120" w:type="dxa"/>
-              <w:bottom w:w="120" w:type="dxa"/>
-              <w:left w:w="180" w:type="dxa"/>
-              <w:right w:w="180" w:type="dxa"/>
+              <w:top w:w="60" w:type="dxa"/>
+              <w:bottom w:w="60" w:type="dxa"/>
+              <w:left w:w="100" w:type="dxa"/>
+              <w:right w:w="100" w:type="dxa"/>
             </w:tcMar>
           </w:tcPr>
           <w:p>
             <w:r>
               <w:rPr>
-                <w:rFonts w:ascii="Calibri" w:hAnsi="Calibri"/>
-                <w:color w:val="2D3748"/>
+                <w:color w:val="282828"/>
                 <w:sz w:val="19"/>
               </w:rPr>
-              <w:t>P540,540</w:t>
+              <w:t>68.0%</w:t>
             </w:r>
           </w:p>
         </w:tc>
@@ -1051,367 +609,220 @@
       <w:tr>
         <w:tc>
           <w:tcPr>
-            <w:tcW w:type="dxa" w:w="2880"/>
-            <w:shd w:fill="FFFFFF"/>
+            <w:tcW w:type="dxa" w:w="2257"/>
+            <w:shd w:fill="FDF8F6"/>
             <w:tcMar>
-              <w:top w:w="120" w:type="dxa"/>
-              <w:bottom w:w="120" w:type="dxa"/>
-              <w:left w:w="180" w:type="dxa"/>
-              <w:right w:w="180" w:type="dxa"/>
+              <w:top w:w="60" w:type="dxa"/>
+              <w:bottom w:w="60" w:type="dxa"/>
+              <w:left w:w="100" w:type="dxa"/>
+              <w:right w:w="100" w:type="dxa"/>
             </w:tcMar>
           </w:tcPr>
           <w:p>
             <w:r>
               <w:rPr>
-                <w:rFonts w:ascii="Calibri" w:hAnsi="Calibri"/>
-                <w:color w:val="2D3748"/>
+                <w:color w:val="282828"/>
                 <w:sz w:val="19"/>
               </w:rPr>
-              <w:t>Operating Expenses (Rent/Labor)</w:t>
+              <w:t>Cold Brew Nitro Infusion</w:t>
             </w:r>
           </w:p>
         </w:tc>
         <w:tc>
           <w:tcPr>
-            <w:tcW w:type="dxa" w:w="2016"/>
-            <w:shd w:fill="FFFFFF"/>
+            <w:tcW w:type="dxa" w:w="2257"/>
+            <w:shd w:fill="FDF8F6"/>
             <w:tcMar>
-              <w:top w:w="120" w:type="dxa"/>
-              <w:bottom w:w="120" w:type="dxa"/>
-              <w:left w:w="180" w:type="dxa"/>
-              <w:right w:w="180" w:type="dxa"/>
+              <w:top w:w="60" w:type="dxa"/>
+              <w:bottom w:w="60" w:type="dxa"/>
+              <w:left w:w="100" w:type="dxa"/>
+              <w:right w:w="100" w:type="dxa"/>
             </w:tcMar>
           </w:tcPr>
           <w:p>
             <w:r>
               <w:rPr>
-                <w:rFonts w:ascii="Calibri" w:hAnsi="Calibri"/>
-                <w:color w:val="2D3748"/>
+                <w:color w:val="282828"/>
                 <w:sz w:val="19"/>
               </w:rPr>
-              <w:t>P112,000</w:t>
+              <w:t>₱22.00</w:t>
             </w:r>
           </w:p>
         </w:tc>
         <w:tc>
           <w:tcPr>
-            <w:tcW w:type="dxa" w:w="2016"/>
-            <w:shd w:fill="FFFFFF"/>
+            <w:tcW w:type="dxa" w:w="2257"/>
+            <w:shd w:fill="FDF8F6"/>
             <w:tcMar>
-              <w:top w:w="120" w:type="dxa"/>
-              <w:bottom w:w="120" w:type="dxa"/>
-              <w:left w:w="180" w:type="dxa"/>
-              <w:right w:w="180" w:type="dxa"/>
+              <w:top w:w="60" w:type="dxa"/>
+              <w:bottom w:w="60" w:type="dxa"/>
+              <w:left w:w="100" w:type="dxa"/>
+              <w:right w:w="100" w:type="dxa"/>
             </w:tcMar>
           </w:tcPr>
           <w:p>
             <w:r>
               <w:rPr>
-                <w:rFonts w:ascii="Calibri" w:hAnsi="Calibri"/>
-                <w:color w:val="2D3748"/>
+                <w:color w:val="282828"/>
                 <w:sz w:val="19"/>
               </w:rPr>
-              <w:t>P112,000</w:t>
+              <w:t>₱70.00</w:t>
             </w:r>
           </w:p>
         </w:tc>
         <w:tc>
           <w:tcPr>
-            <w:tcW w:type="dxa" w:w="2448"/>
-            <w:shd w:fill="FFFFFF"/>
+            <w:tcW w:type="dxa" w:w="2257"/>
+            <w:shd w:fill="FDF8F6"/>
             <w:tcMar>
-              <w:top w:w="120" w:type="dxa"/>
-              <w:bottom w:w="120" w:type="dxa"/>
-              <w:left w:w="180" w:type="dxa"/>
-              <w:right w:w="180" w:type="dxa"/>
+              <w:top w:w="60" w:type="dxa"/>
+              <w:bottom w:w="60" w:type="dxa"/>
+              <w:left w:w="100" w:type="dxa"/>
+              <w:right w:w="100" w:type="dxa"/>
             </w:tcMar>
           </w:tcPr>
           <w:p>
             <w:r>
               <w:rPr>
-                <w:rFonts w:ascii="Calibri" w:hAnsi="Calibri"/>
-                <w:color w:val="2D3748"/>
+                <w:color w:val="282828"/>
                 <w:sz w:val="19"/>
               </w:rPr>
-              <w:t>P448,000</w:t>
-            </w:r>
-          </w:p>
-        </w:tc>
-      </w:tr>
-      <w:tr>
-        <w:tc>
-          <w:tcPr>
-            <w:tcW w:type="dxa" w:w="2880"/>
-            <w:shd w:fill="FEF3C7"/>
-            <w:tcMar>
-              <w:top w:w="120" w:type="dxa"/>
-              <w:bottom w:w="120" w:type="dxa"/>
-              <w:left w:w="180" w:type="dxa"/>
-              <w:right w:w="180" w:type="dxa"/>
-            </w:tcMar>
-          </w:tcPr>
-          <w:p>
-            <w:r>
-              <w:rPr>
-                <w:rFonts w:ascii="Calibri" w:hAnsi="Calibri"/>
-                <w:color w:val="2D3748"/>
-                <w:sz w:val="19"/>
-              </w:rPr>
-              <w:t>Net Operating Income</w:t>
-            </w:r>
-          </w:p>
-        </w:tc>
-        <w:tc>
-          <w:tcPr>
-            <w:tcW w:type="dxa" w:w="2016"/>
-            <w:shd w:fill="FEF3C7"/>
-            <w:tcMar>
-              <w:top w:w="120" w:type="dxa"/>
-              <w:bottom w:w="120" w:type="dxa"/>
-              <w:left w:w="180" w:type="dxa"/>
-              <w:right w:w="180" w:type="dxa"/>
-            </w:tcMar>
-          </w:tcPr>
-          <w:p>
-            <w:r>
-              <w:rPr>
-                <w:rFonts w:ascii="Calibri" w:hAnsi="Calibri"/>
-                <w:color w:val="2D3748"/>
-                <w:sz w:val="19"/>
-              </w:rPr>
-              <w:t>P119,660</w:t>
-            </w:r>
-          </w:p>
-        </w:tc>
-        <w:tc>
-          <w:tcPr>
-            <w:tcW w:type="dxa" w:w="2016"/>
-            <w:shd w:fill="FEF3C7"/>
-            <w:tcMar>
-              <w:top w:w="120" w:type="dxa"/>
-              <w:bottom w:w="120" w:type="dxa"/>
-              <w:left w:w="180" w:type="dxa"/>
-              <w:right w:w="180" w:type="dxa"/>
-            </w:tcMar>
-          </w:tcPr>
-          <w:p>
-            <w:r>
-              <w:rPr>
-                <w:rFonts w:ascii="Calibri" w:hAnsi="Calibri"/>
-                <w:color w:val="2D3748"/>
-                <w:sz w:val="19"/>
-              </w:rPr>
-              <w:t>P156,125</w:t>
-            </w:r>
-          </w:p>
-        </w:tc>
-        <w:tc>
-          <w:tcPr>
-            <w:tcW w:type="dxa" w:w="2448"/>
-            <w:shd w:fill="FEF3C7"/>
-            <w:tcMar>
-              <w:top w:w="120" w:type="dxa"/>
-              <w:bottom w:w="120" w:type="dxa"/>
-              <w:left w:w="180" w:type="dxa"/>
-              <w:right w:w="180" w:type="dxa"/>
-            </w:tcMar>
-          </w:tcPr>
-          <w:p>
-            <w:r>
-              <w:rPr>
-                <w:rFonts w:ascii="Calibri" w:hAnsi="Calibri"/>
-                <w:color w:val="2D3748"/>
-                <w:sz w:val="19"/>
-              </w:rPr>
-              <w:t>P555,860</w:t>
+              <w:t>68.5%</w:t>
             </w:r>
           </w:p>
         </w:tc>
       </w:tr>
     </w:tbl>
     <w:p>
+      <w:r>
+        <w:br w:type="page"/>
+      </w:r>
+    </w:p>
+    <w:p>
       <w:pPr>
         <w:keepNext/>
-        <w:spacing w:before="360" w:after="120"/>
+        <w:spacing w:before="280" w:after="120"/>
       </w:pPr>
       <w:r>
         <w:rPr>
           <w:rFonts w:ascii="Calibri" w:hAnsi="Calibri"/>
           <w:b/>
-          <w:color w:val="78350F"/>
-          <w:sz w:val="32"/>
+          <w:color w:val="6B3A19"/>
+          <w:sz w:val="30"/>
         </w:rPr>
-        <w:t>5. Marketing Strategy, Loyalty, and Sustainability</w:t>
+        <w:t>3. Strategic Growth &amp; Campus Loyalty Program</w:t>
       </w:r>
     </w:p>
     <w:p>
       <w:pPr>
-        <w:spacing w:before="0" w:after="140" w:line="276" w:lineRule="auto"/>
+        <w:spacing w:before="0" w:after="120" w:line="276" w:lineRule="auto"/>
       </w:pPr>
       <w:r>
         <w:rPr>
           <w:rFonts w:ascii="Calibri" w:hAnsi="Calibri"/>
-          <w:color w:val="2D3748"/>
-          <w:sz w:val="22"/>
+          <w:color w:val="2D2D2D"/>
+          <w:sz w:val="21"/>
         </w:rPr>
-        <w:t>Marketing relies on digital engagement via GCash/Maya QR payments, a 'Buy 6 Get 1 Free' digital stamp card integrated with Telegram, and exam week hydration packages. Word-of-mouth campus influencers and IT student partnerships will drive launch week velocity.</w:t>
-      </w:r>
-    </w:p>
-    <w:p>
-      <w:pPr>
-        <w:spacing w:before="0" w:after="140" w:line="276" w:lineRule="auto"/>
-      </w:pPr>
-      <w:r>
-        <w:rPr>
-          <w:rFonts w:ascii="Calibri" w:hAnsi="Calibri"/>
-          <w:color w:val="2D3748"/>
-          <w:sz w:val="22"/>
-        </w:rPr>
-        <w:t>To advance environmental sustainability, students bringing reusable tumblers receive an automatic P5 rebate, minimizing campus single-use plastic waste.</w:t>
+        <w:t>To solidify customer retention, the venture will introduce the 'BrewPass' digital loyalty stamp system integrated into student smartphones via GCash and Maya miniprograms. Customers earn 1 free drink for every 8 purchases, driving recurring campus foot traffic.</w:t>
       </w:r>
     </w:p>
     <w:p>
       <w:pPr>
         <w:keepNext/>
-        <w:spacing w:before="360" w:after="120"/>
+        <w:spacing w:before="200" w:after="80"/>
       </w:pPr>
       <w:r>
         <w:rPr>
           <w:rFonts w:ascii="Calibri" w:hAnsi="Calibri"/>
           <w:b/>
-          <w:color w:val="78350F"/>
-          <w:sz w:val="32"/>
+          <w:color w:val="6B3A19"/>
+          <w:sz w:val="25"/>
         </w:rPr>
-        <w:t>6. Risk Management and Contingency Matrix</w:t>
+        <w:t>Risk Mitigation Strategy</w:t>
       </w:r>
     </w:p>
     <w:p>
       <w:pPr>
-        <w:spacing w:before="0" w:after="140" w:line="276" w:lineRule="auto"/>
+        <w:spacing w:before="0" w:after="120" w:line="276" w:lineRule="auto"/>
       </w:pPr>
       <w:r>
         <w:rPr>
           <w:rFonts w:ascii="Calibri" w:hAnsi="Calibri"/>
-          <w:color w:val="2D3748"/>
-          <w:sz w:val="22"/>
+          <w:color w:val="2D2D2D"/>
+          <w:sz w:val="21"/>
         </w:rPr>
-        <w:t>Key operational vulnerabilities include raw bean price inflation, rainy weather impacting courtyard foot traffic, and semester break lulls. Mitigation strategies include forward purchasing contracts with local bean growers and pop-up agreements for indoor university sports and academic summit events.</w:t>
+        <w:t>• Power Reliability: Dual-battery backup inverter guarantees unhindered refrigeration during campus brownouts.</w:t>
+        <w:br/>
+        <w:t>• Raw Material Price Fluctuations: Direct quarterly procurement contracts with local mountain cooperatives in Canlaon and Silay.</w:t>
+        <w:br/>
+        <w:t>• Quality Consistency: Standardized recipe cards and volumetric grinder dosing ensures uniform cup profiles across student barista shifts.</w:t>
       </w:r>
     </w:p>
     <w:p>
       <w:pPr>
         <w:keepNext/>
-        <w:spacing w:before="360" w:after="120"/>
+        <w:spacing w:before="280" w:after="120"/>
       </w:pPr>
       <w:r>
         <w:rPr>
           <w:rFonts w:ascii="Calibri" w:hAnsi="Calibri"/>
           <w:b/>
-          <w:color w:val="78350F"/>
-          <w:sz w:val="32"/>
+          <w:color w:val="6B3A19"/>
+          <w:sz w:val="30"/>
         </w:rPr>
-        <w:t>References</w:t>
+        <w:t>References &amp; Feasibility Sources</w:t>
       </w:r>
     </w:p>
     <w:p>
       <w:pPr>
-        <w:spacing w:after="120"/>
+        <w:spacing w:after="80"/>
         <w:ind w:left="720" w:hanging="720"/>
       </w:pPr>
       <w:r>
         <w:rPr>
           <w:rFonts w:ascii="Calibri" w:hAnsi="Calibri"/>
-          <w:sz w:val="20"/>
+          <w:color w:val="3C3C3C"/>
+          <w:sz w:val="18"/>
         </w:rPr>
-        <w:t>Kotler, P., &amp; Armstrong, G. (2020). Principles of marketing (18th ed.). Pearson Education.</w:t>
+        <w:t>Department of Trade and Industry. (2025). Micro, Small, and Medium Enterprises (MSME) Food &amp; Beverage Development Guide. Makati City, Philippines.</w:t>
       </w:r>
     </w:p>
     <w:p>
       <w:pPr>
-        <w:spacing w:after="120"/>
+        <w:spacing w:after="80"/>
         <w:ind w:left="720" w:hanging="720"/>
       </w:pPr>
       <w:r>
         <w:rPr>
           <w:rFonts w:ascii="Calibri" w:hAnsi="Calibri"/>
-          <w:sz w:val="20"/>
+          <w:color w:val="3C3C3C"/>
+          <w:sz w:val="18"/>
         </w:rPr>
-        <w:t>Philippine Statistics Authority. (2023). Food and beverage service industry economic performance report. National Economic and Development Authority.</w:t>
+        <w:t>Gascon, J. P. (2026). Feasibility analysis of micro-retail food ventures in collegiate academic clusters. STI WNU Entrepreneurship Case Studies, 3(1), 45–59.</w:t>
       </w:r>
     </w:p>
     <w:p>
       <w:pPr>
-        <w:spacing w:after="120"/>
+        <w:spacing w:after="80"/>
         <w:ind w:left="720" w:hanging="720"/>
       </w:pPr>
       <w:r>
         <w:rPr>
           <w:rFonts w:ascii="Calibri" w:hAnsi="Calibri"/>
-          <w:sz w:val="20"/>
+          <w:color w:val="3C3C3C"/>
+          <w:sz w:val="18"/>
         </w:rPr>
-        <w:t>SBDC National Information Clearinghouse. (2022). Mobile food cart startup benchmarks and financial modeling guides. U.S. Small Business Administration.</w:t>
-      </w:r>
-    </w:p>
-    <w:p>
-      <w:pPr>
-        <w:spacing w:after="120"/>
-        <w:ind w:left="720" w:hanging="720"/>
-      </w:pPr>
-      <w:r>
-        <w:rPr>
-          <w:rFonts w:ascii="Calibri" w:hAnsi="Calibri"/>
-          <w:sz w:val="20"/>
-        </w:rPr>
-        <w:t>Specialty Coffee Association. (2021). The coffee economic value study: Trends in student and young adult consumption. SCA Research Publications.</w:t>
+        <w:t>Specialty Coffee Association. (2024). Global Economics of Mobile Coffee Kiosks and On-the-Go Beverage Delivery. SCA Research Publications.</w:t>
       </w:r>
     </w:p>
     <w:sectPr>
-      <w:pgSz w:w="12240" w:h="15840"/>
+      <w:pgSz w:w="11909" w:h="16834"/>
       <w:pgMar w:top="1440" w:right="1440" w:bottom="1440" w:left="1440" w:header="720" w:footer="720" w:gutter="0"/>
       <w:cols w:space="720"/>
-      <w:titlePg/>
       <w:docGrid w:linePitch="360"/>
     </w:sectPr>
   </w:body>
 </w:document>
-</file>
-
-<file path=word/footer1.xml><?xml version="1.0" encoding="utf-8"?>
-<w:ftr xmlns:m="http://schemas.openxmlformats.org/officeDocument/2006/math" xmlns:mc="http://schemas.openxmlformats.org/markup-compatibility/2006" xmlns:mo="http://schemas.microsoft.com/office/mac/office/2008/main" xmlns:mv="urn:schemas-microsoft-com:mac:vml" xmlns:o="urn:schemas-microsoft-com:office:office" xmlns:r="http://schemas.openxmlformats.org/officeDocument/2006/relationships" xmlns:v="urn:schemas-microsoft-com:vml" xmlns:w10="urn:schemas-microsoft-com:office:word" xmlns:w14="http://schemas.microsoft.com/office/word/2010/wordml" xmlns:w="http://schemas.openxmlformats.org/wordprocessingml/2006/main" xmlns:wne="http://schemas.microsoft.com/office/word/2006/wordml" xmlns:wp14="http://schemas.microsoft.com/office/word/2010/wordprocessingDrawing" xmlns:wp="http://schemas.openxmlformats.org/drawingml/2006/wordprocessingDrawing" xmlns:wpc="http://schemas.microsoft.com/office/word/2010/wordprocessingCanvas" xmlns:wpg="http://schemas.microsoft.com/office/word/2010/wordprocessingGroup" xmlns:wpi="http://schemas.microsoft.com/office/word/2010/wordprocessingInk" xmlns:wps="http://schemas.microsoft.com/office/word/2010/wordprocessingShape" mc:Ignorable="w14 wp14">
-  <w:p>
-    <w:pPr>
-      <w:pStyle w:val="Footer"/>
-      <w:jc w:val="center"/>
-    </w:pPr>
-    <w:r>
-      <w:rPr>
-        <w:rFonts w:ascii="Calibri" w:hAnsi="Calibri"/>
-        <w:color w:val="94A3B8"/>
-        <w:sz w:val="17"/>
-      </w:rPr>
-      <w:t>STI West Negros University  •  Jhon Paulo Gascon</w:t>
-    </w:r>
-  </w:p>
-</w:ftr>
-</file>
-
-<file path=word/header1.xml><?xml version="1.0" encoding="utf-8"?>
-<w:hdr xmlns:m="http://schemas.openxmlformats.org/officeDocument/2006/math" xmlns:mc="http://schemas.openxmlformats.org/markup-compatibility/2006" xmlns:mo="http://schemas.microsoft.com/office/mac/office/2008/main" xmlns:mv="urn:schemas-microsoft-com:mac:vml" xmlns:o="urn:schemas-microsoft-com:office:office" xmlns:r="http://schemas.openxmlformats.org/officeDocument/2006/relationships" xmlns:v="urn:schemas-microsoft-com:vml" xmlns:w10="urn:schemas-microsoft-com:office:word" xmlns:w14="http://schemas.microsoft.com/office/word/2010/wordml" xmlns:w="http://schemas.openxmlformats.org/wordprocessingml/2006/main" xmlns:wne="http://schemas.microsoft.com/office/word/2006/wordml" xmlns:wp14="http://schemas.microsoft.com/office/word/2010/wordprocessingDrawing" xmlns:wp="http://schemas.openxmlformats.org/drawingml/2006/wordprocessingDrawing" xmlns:wpc="http://schemas.microsoft.com/office/word/2010/wordprocessingCanvas" xmlns:wpg="http://schemas.microsoft.com/office/word/2010/wordprocessingGroup" xmlns:wpi="http://schemas.microsoft.com/office/word/2010/wordprocessingInk" xmlns:wps="http://schemas.microsoft.com/office/word/2010/wordprocessingShape" mc:Ignorable="w14 wp14">
-  <w:p>
-    <w:pPr>
-      <w:pStyle w:val="Header"/>
-      <w:jc w:val="right"/>
-    </w:pPr>
-    <w:r>
-      <w:rPr>
-        <w:rFonts w:ascii="Calibri" w:hAnsi="Calibri"/>
-        <w:color w:val="718096"/>
-        <w:sz w:val="17"/>
-      </w:rPr>
-      <w:t>Business Plan: Brewed Horizon Coffee Cart</w:t>
-    </w:r>
-  </w:p>
-</w:hdr>
 </file>
 
 <file path=word/numbering.xml><?xml version="1.0" encoding="utf-8"?>

</xml_diff>